<commit_message>
feat: fix mobile scrollreveal slide overflow, admin login positioning, and responsive admin dashboard charts/calendar/reviews
</commit_message>
<xml_diff>
--- a/bukiapartman1.docx
+++ b/bukiapartman1.docx
@@ -10,32 +10,6 @@
       <w:proofErr w:type="spellEnd"/>
       <w:r>
         <w:t xml:space="preserve"> fiók:</w:t>
-      </w:r>
-    </w:p>
-    <w:p>
-      <w:hyperlink r:id="rId4" w:history="1">
-        <w:r>
-          <w:rPr>
-            <w:rStyle w:val="Hiperhivatkozs"/>
-          </w:rPr>
-          <w:t>bukiapartman1@gmail.com</w:t>
-        </w:r>
-      </w:hyperlink>
-    </w:p>
-    <w:p>
-      <w:r>
-        <w:t>Bapart123Buk?</w:t>
-      </w:r>
-    </w:p>
-    <w:p/>
-    <w:p>
-      <w:proofErr w:type="spellStart"/>
-      <w:r>
-        <w:t>Github</w:t>
-      </w:r>
-      <w:proofErr w:type="spellEnd"/>
-      <w:r>
-        <w:t>:</w:t>
       </w:r>
     </w:p>
     <w:p>
@@ -50,6 +24,32 @@
     </w:p>
     <w:p>
       <w:r>
+        <w:t>Bapart123Buk?</w:t>
+      </w:r>
+    </w:p>
+    <w:p/>
+    <w:p>
+      <w:proofErr w:type="spellStart"/>
+      <w:r>
+        <w:t>Github</w:t>
+      </w:r>
+      <w:proofErr w:type="spellEnd"/>
+      <w:r>
+        <w:t>:</w:t>
+      </w:r>
+    </w:p>
+    <w:p>
+      <w:hyperlink r:id="rId6" w:history="1">
+        <w:r>
+          <w:rPr>
+            <w:rStyle w:val="Hiperhivatkozs"/>
+          </w:rPr>
+          <w:t>bukiapartman1@gmail.com</w:t>
+        </w:r>
+      </w:hyperlink>
+    </w:p>
+    <w:p>
+      <w:r>
         <w:t>bukiapartman1</w:t>
       </w:r>
     </w:p>
@@ -57,6 +57,225 @@
       <w:r>
         <w:t>Bapart123Buk?</w:t>
       </w:r>
+    </w:p>
+    <w:p/>
+    <w:p>
+      <w:r>
+        <w:t>Adatbázis:</w:t>
+      </w:r>
+    </w:p>
+    <w:p>
+      <w:hyperlink r:id="rId7" w:history="1">
+        <w:r>
+          <w:rPr>
+            <w:rStyle w:val="Hiperhivatkozs"/>
+          </w:rPr>
+          <w:t xml:space="preserve">Neon </w:t>
+        </w:r>
+        <w:proofErr w:type="spellStart"/>
+        <w:r>
+          <w:rPr>
+            <w:rStyle w:val="Hiperhivatkozs"/>
+          </w:rPr>
+          <w:t>Serverless</w:t>
+        </w:r>
+        <w:proofErr w:type="spellEnd"/>
+        <w:r>
+          <w:rPr>
+            <w:rStyle w:val="Hiperhivatkozs"/>
+          </w:rPr>
+          <w:t xml:space="preserve"> </w:t>
+        </w:r>
+        <w:proofErr w:type="spellStart"/>
+        <w:r>
+          <w:rPr>
+            <w:rStyle w:val="Hiperhivatkozs"/>
+          </w:rPr>
+          <w:t>Postgres</w:t>
+        </w:r>
+        <w:proofErr w:type="spellEnd"/>
+        <w:r>
+          <w:rPr>
+            <w:rStyle w:val="Hiperhivatkozs"/>
+          </w:rPr>
+          <w:t xml:space="preserve"> — </w:t>
+        </w:r>
+        <w:proofErr w:type="spellStart"/>
+        <w:r>
+          <w:rPr>
+            <w:rStyle w:val="Hiperhivatkozs"/>
+          </w:rPr>
+          <w:t>Ship</w:t>
+        </w:r>
+        <w:proofErr w:type="spellEnd"/>
+        <w:r>
+          <w:rPr>
+            <w:rStyle w:val="Hiperhivatkozs"/>
+          </w:rPr>
+          <w:t xml:space="preserve"> </w:t>
+        </w:r>
+        <w:proofErr w:type="spellStart"/>
+        <w:r>
+          <w:rPr>
+            <w:rStyle w:val="Hiperhivatkozs"/>
+          </w:rPr>
+          <w:t>faster</w:t>
+        </w:r>
+        <w:proofErr w:type="spellEnd"/>
+      </w:hyperlink>
+      <w:r>
+        <w:t>:</w:t>
+      </w:r>
+    </w:p>
+    <w:p>
+      <w:proofErr w:type="spellStart"/>
+      <w:r>
+        <w:t>Githubbal</w:t>
+      </w:r>
+      <w:proofErr w:type="spellEnd"/>
+      <w:r>
+        <w:t xml:space="preserve"> regisztrálva</w:t>
+      </w:r>
+    </w:p>
+    <w:p/>
+    <w:p>
+      <w:r>
+        <w:t>Booking.com számára megadandó link: https://apartman-web.vercel.app/api/calendar/export</w:t>
+      </w:r>
+      <w:proofErr w:type="gramStart"/>
+      <w:r>
+        <w:t>?channel</w:t>
+      </w:r>
+      <w:proofErr w:type="gramEnd"/>
+      <w:r>
+        <w:t xml:space="preserve">=booking (Kiszűri a </w:t>
+      </w:r>
+      <w:proofErr w:type="spellStart"/>
+      <w:r>
+        <w:t>Booking.com-ról</w:t>
+      </w:r>
+      <w:proofErr w:type="spellEnd"/>
+      <w:r>
+        <w:t xml:space="preserve"> származó foglalásokat, csak a weboldalas és a </w:t>
+      </w:r>
+      <w:proofErr w:type="spellStart"/>
+      <w:r>
+        <w:t>Szallas.hu-s</w:t>
+      </w:r>
+      <w:proofErr w:type="spellEnd"/>
+      <w:r>
+        <w:t xml:space="preserve"> foglalásokat küldi el nekik).</w:t>
+      </w:r>
+    </w:p>
+    <w:p>
+      <w:r>
+        <w:t>Szallas.hu számára megadandó link: https://apartman-web.vercel.app/api/calendar/export</w:t>
+      </w:r>
+      <w:proofErr w:type="gramStart"/>
+      <w:r>
+        <w:t>?channel</w:t>
+      </w:r>
+      <w:proofErr w:type="gramEnd"/>
+      <w:r>
+        <w:t xml:space="preserve">=szallas (Kiszűri a </w:t>
+      </w:r>
+      <w:proofErr w:type="spellStart"/>
+      <w:r>
+        <w:t>Szallas.hu-s</w:t>
+      </w:r>
+      <w:proofErr w:type="spellEnd"/>
+      <w:r>
+        <w:t xml:space="preserve"> foglalásokat, csak a weboldalas és a </w:t>
+      </w:r>
+      <w:proofErr w:type="spellStart"/>
+      <w:r>
+        <w:t>Booking.com-os</w:t>
+      </w:r>
+      <w:proofErr w:type="spellEnd"/>
+      <w:r>
+        <w:t xml:space="preserve"> foglalásokat küldi el nekik).</w:t>
+      </w:r>
+    </w:p>
+    <w:p>
+      <w:r>
+        <w:t xml:space="preserve">Ahhoz, hogy az </w:t>
+      </w:r>
+      <w:proofErr w:type="spellStart"/>
+      <w:r>
+        <w:t>iCal</w:t>
+      </w:r>
+      <w:proofErr w:type="spellEnd"/>
+      <w:r>
+        <w:t xml:space="preserve"> </w:t>
+      </w:r>
+      <w:proofErr w:type="spellStart"/>
+      <w:r>
+        <w:t>szinkronizáció</w:t>
+      </w:r>
+      <w:proofErr w:type="spellEnd"/>
+      <w:r>
+        <w:t xml:space="preserve"> beinduljon, be kell állítanod a külső naptárak linkjeit a </w:t>
+      </w:r>
+      <w:proofErr w:type="spellStart"/>
+      <w:r>
+        <w:t>Vercel-en</w:t>
+      </w:r>
+      <w:proofErr w:type="spellEnd"/>
+      <w:r>
+        <w:t xml:space="preserve"> (a DATABASE_URL környezeti változó mellé, a </w:t>
+      </w:r>
+      <w:proofErr w:type="spellStart"/>
+      <w:r>
+        <w:t>Settings</w:t>
+      </w:r>
+      <w:proofErr w:type="spellEnd"/>
+      <w:r>
+        <w:t xml:space="preserve"> -&gt; </w:t>
+      </w:r>
+      <w:proofErr w:type="spellStart"/>
+      <w:r>
+        <w:t>Environment</w:t>
+      </w:r>
+      <w:proofErr w:type="spellEnd"/>
+      <w:r>
+        <w:t xml:space="preserve"> </w:t>
+      </w:r>
+      <w:proofErr w:type="spellStart"/>
+      <w:r>
+        <w:t>Variables</w:t>
+      </w:r>
+      <w:proofErr w:type="spellEnd"/>
+      <w:r>
+        <w:t> menüpontban):</w:t>
+      </w:r>
+    </w:p>
+    <w:p>
+      <w:r>
+        <w:t>ICAL_URL_BOOKING: A Booking.com portálon generált naptárexport link (pl. https://ical.booking.com/...).</w:t>
+      </w:r>
+    </w:p>
+    <w:p>
+      <w:r>
+        <w:t>ICAL_URL_SZALLAS: A Szallas.hu portálon generált naptárexport link.</w:t>
+      </w:r>
+    </w:p>
+    <w:p>
+      <w:r>
+        <w:t xml:space="preserve">Ha ezeket megadtad, a </w:t>
+      </w:r>
+      <w:proofErr w:type="spellStart"/>
+      <w:r>
+        <w:t>szinkronizáció</w:t>
+      </w:r>
+      <w:proofErr w:type="spellEnd"/>
+      <w:r>
+        <w:t xml:space="preserve"> azonnal bekapcsol. Ha üresen hagyod őket, a rendszer csak a helyi adatbázisból dolgozik.</w:t>
+      </w:r>
+    </w:p>
+    <w:p>
+      <w:pPr>
+        <w:pStyle w:val="NormlWeb"/>
+      </w:pPr>
     </w:p>
     <w:p/>
     <w:sectPr>
@@ -67,6 +286,583 @@
     </w:sectPr>
   </w:body>
 </w:document>
+</file>
+
+<file path=word/numbering.xml><?xml version="1.0" encoding="utf-8"?>
+<w:numbering xmlns:ve="http://schemas.openxmlformats.org/markup-compatibility/2006" xmlns:o="urn:schemas-microsoft-com:office:office" xmlns:r="http://schemas.openxmlformats.org/officeDocument/2006/relationships" xmlns:m="http://schemas.openxmlformats.org/officeDocument/2006/math" xmlns:v="urn:schemas-microsoft-com:vml" xmlns:wp="http://schemas.openxmlformats.org/drawingml/2006/wordprocessingDrawing" xmlns:w10="urn:schemas-microsoft-com:office:word" xmlns:w="http://schemas.openxmlformats.org/wordprocessingml/2006/main" xmlns:wne="http://schemas.microsoft.com/office/word/2006/wordml">
+  <w:abstractNum w:abstractNumId="0">
+    <w:nsid w:val="311079CE"/>
+    <w:multiLevelType w:val="multilevel"/>
+    <w:tmpl w:val="4B4E49B2"/>
+    <w:lvl w:ilvl="0">
+      <w:start w:val="1"/>
+      <w:numFmt w:val="bullet"/>
+      <w:lvlText w:val=""/>
+      <w:lvlJc w:val="left"/>
+      <w:pPr>
+        <w:tabs>
+          <w:tab w:val="num" w:pos="720"/>
+        </w:tabs>
+        <w:ind w:left="720" w:hanging="360"/>
+      </w:pPr>
+      <w:rPr>
+        <w:rFonts w:ascii="Symbol" w:hAnsi="Symbol" w:hint="default"/>
+        <w:sz w:val="20"/>
+      </w:rPr>
+    </w:lvl>
+    <w:lvl w:ilvl="1" w:tentative="1">
+      <w:start w:val="1"/>
+      <w:numFmt w:val="bullet"/>
+      <w:lvlText w:val=""/>
+      <w:lvlJc w:val="left"/>
+      <w:pPr>
+        <w:tabs>
+          <w:tab w:val="num" w:pos="1440"/>
+        </w:tabs>
+        <w:ind w:left="1440" w:hanging="360"/>
+      </w:pPr>
+      <w:rPr>
+        <w:rFonts w:ascii="Symbol" w:hAnsi="Symbol" w:hint="default"/>
+        <w:sz w:val="20"/>
+      </w:rPr>
+    </w:lvl>
+    <w:lvl w:ilvl="2" w:tentative="1">
+      <w:start w:val="1"/>
+      <w:numFmt w:val="bullet"/>
+      <w:lvlText w:val=""/>
+      <w:lvlJc w:val="left"/>
+      <w:pPr>
+        <w:tabs>
+          <w:tab w:val="num" w:pos="2160"/>
+        </w:tabs>
+        <w:ind w:left="2160" w:hanging="360"/>
+      </w:pPr>
+      <w:rPr>
+        <w:rFonts w:ascii="Symbol" w:hAnsi="Symbol" w:hint="default"/>
+        <w:sz w:val="20"/>
+      </w:rPr>
+    </w:lvl>
+    <w:lvl w:ilvl="3" w:tentative="1">
+      <w:start w:val="1"/>
+      <w:numFmt w:val="bullet"/>
+      <w:lvlText w:val=""/>
+      <w:lvlJc w:val="left"/>
+      <w:pPr>
+        <w:tabs>
+          <w:tab w:val="num" w:pos="2880"/>
+        </w:tabs>
+        <w:ind w:left="2880" w:hanging="360"/>
+      </w:pPr>
+      <w:rPr>
+        <w:rFonts w:ascii="Symbol" w:hAnsi="Symbol" w:hint="default"/>
+        <w:sz w:val="20"/>
+      </w:rPr>
+    </w:lvl>
+    <w:lvl w:ilvl="4" w:tentative="1">
+      <w:start w:val="1"/>
+      <w:numFmt w:val="bullet"/>
+      <w:lvlText w:val=""/>
+      <w:lvlJc w:val="left"/>
+      <w:pPr>
+        <w:tabs>
+          <w:tab w:val="num" w:pos="3600"/>
+        </w:tabs>
+        <w:ind w:left="3600" w:hanging="360"/>
+      </w:pPr>
+      <w:rPr>
+        <w:rFonts w:ascii="Symbol" w:hAnsi="Symbol" w:hint="default"/>
+        <w:sz w:val="20"/>
+      </w:rPr>
+    </w:lvl>
+    <w:lvl w:ilvl="5" w:tentative="1">
+      <w:start w:val="1"/>
+      <w:numFmt w:val="bullet"/>
+      <w:lvlText w:val=""/>
+      <w:lvlJc w:val="left"/>
+      <w:pPr>
+        <w:tabs>
+          <w:tab w:val="num" w:pos="4320"/>
+        </w:tabs>
+        <w:ind w:left="4320" w:hanging="360"/>
+      </w:pPr>
+      <w:rPr>
+        <w:rFonts w:ascii="Symbol" w:hAnsi="Symbol" w:hint="default"/>
+        <w:sz w:val="20"/>
+      </w:rPr>
+    </w:lvl>
+    <w:lvl w:ilvl="6" w:tentative="1">
+      <w:start w:val="1"/>
+      <w:numFmt w:val="bullet"/>
+      <w:lvlText w:val=""/>
+      <w:lvlJc w:val="left"/>
+      <w:pPr>
+        <w:tabs>
+          <w:tab w:val="num" w:pos="5040"/>
+        </w:tabs>
+        <w:ind w:left="5040" w:hanging="360"/>
+      </w:pPr>
+      <w:rPr>
+        <w:rFonts w:ascii="Symbol" w:hAnsi="Symbol" w:hint="default"/>
+        <w:sz w:val="20"/>
+      </w:rPr>
+    </w:lvl>
+    <w:lvl w:ilvl="7" w:tentative="1">
+      <w:start w:val="1"/>
+      <w:numFmt w:val="bullet"/>
+      <w:lvlText w:val=""/>
+      <w:lvlJc w:val="left"/>
+      <w:pPr>
+        <w:tabs>
+          <w:tab w:val="num" w:pos="5760"/>
+        </w:tabs>
+        <w:ind w:left="5760" w:hanging="360"/>
+      </w:pPr>
+      <w:rPr>
+        <w:rFonts w:ascii="Symbol" w:hAnsi="Symbol" w:hint="default"/>
+        <w:sz w:val="20"/>
+      </w:rPr>
+    </w:lvl>
+    <w:lvl w:ilvl="8" w:tentative="1">
+      <w:start w:val="1"/>
+      <w:numFmt w:val="bullet"/>
+      <w:lvlText w:val=""/>
+      <w:lvlJc w:val="left"/>
+      <w:pPr>
+        <w:tabs>
+          <w:tab w:val="num" w:pos="6480"/>
+        </w:tabs>
+        <w:ind w:left="6480" w:hanging="360"/>
+      </w:pPr>
+      <w:rPr>
+        <w:rFonts w:ascii="Symbol" w:hAnsi="Symbol" w:hint="default"/>
+        <w:sz w:val="20"/>
+      </w:rPr>
+    </w:lvl>
+  </w:abstractNum>
+  <w:abstractNum w:abstractNumId="1">
+    <w:nsid w:val="36FB0A57"/>
+    <w:multiLevelType w:val="multilevel"/>
+    <w:tmpl w:val="B40E180C"/>
+    <w:lvl w:ilvl="0">
+      <w:start w:val="1"/>
+      <w:numFmt w:val="bullet"/>
+      <w:lvlText w:val=""/>
+      <w:lvlJc w:val="left"/>
+      <w:pPr>
+        <w:tabs>
+          <w:tab w:val="num" w:pos="720"/>
+        </w:tabs>
+        <w:ind w:left="720" w:hanging="360"/>
+      </w:pPr>
+      <w:rPr>
+        <w:rFonts w:ascii="Symbol" w:hAnsi="Symbol" w:hint="default"/>
+        <w:sz w:val="20"/>
+      </w:rPr>
+    </w:lvl>
+    <w:lvl w:ilvl="1" w:tentative="1">
+      <w:start w:val="1"/>
+      <w:numFmt w:val="bullet"/>
+      <w:lvlText w:val="o"/>
+      <w:lvlJc w:val="left"/>
+      <w:pPr>
+        <w:tabs>
+          <w:tab w:val="num" w:pos="1440"/>
+        </w:tabs>
+        <w:ind w:left="1440" w:hanging="360"/>
+      </w:pPr>
+      <w:rPr>
+        <w:rFonts w:ascii="Courier New" w:hAnsi="Courier New" w:hint="default"/>
+        <w:sz w:val="20"/>
+      </w:rPr>
+    </w:lvl>
+    <w:lvl w:ilvl="2" w:tentative="1">
+      <w:start w:val="1"/>
+      <w:numFmt w:val="bullet"/>
+      <w:lvlText w:val=""/>
+      <w:lvlJc w:val="left"/>
+      <w:pPr>
+        <w:tabs>
+          <w:tab w:val="num" w:pos="2160"/>
+        </w:tabs>
+        <w:ind w:left="2160" w:hanging="360"/>
+      </w:pPr>
+      <w:rPr>
+        <w:rFonts w:ascii="Wingdings" w:hAnsi="Wingdings" w:hint="default"/>
+        <w:sz w:val="20"/>
+      </w:rPr>
+    </w:lvl>
+    <w:lvl w:ilvl="3" w:tentative="1">
+      <w:start w:val="1"/>
+      <w:numFmt w:val="bullet"/>
+      <w:lvlText w:val=""/>
+      <w:lvlJc w:val="left"/>
+      <w:pPr>
+        <w:tabs>
+          <w:tab w:val="num" w:pos="2880"/>
+        </w:tabs>
+        <w:ind w:left="2880" w:hanging="360"/>
+      </w:pPr>
+      <w:rPr>
+        <w:rFonts w:ascii="Wingdings" w:hAnsi="Wingdings" w:hint="default"/>
+        <w:sz w:val="20"/>
+      </w:rPr>
+    </w:lvl>
+    <w:lvl w:ilvl="4" w:tentative="1">
+      <w:start w:val="1"/>
+      <w:numFmt w:val="bullet"/>
+      <w:lvlText w:val=""/>
+      <w:lvlJc w:val="left"/>
+      <w:pPr>
+        <w:tabs>
+          <w:tab w:val="num" w:pos="3600"/>
+        </w:tabs>
+        <w:ind w:left="3600" w:hanging="360"/>
+      </w:pPr>
+      <w:rPr>
+        <w:rFonts w:ascii="Wingdings" w:hAnsi="Wingdings" w:hint="default"/>
+        <w:sz w:val="20"/>
+      </w:rPr>
+    </w:lvl>
+    <w:lvl w:ilvl="5" w:tentative="1">
+      <w:start w:val="1"/>
+      <w:numFmt w:val="bullet"/>
+      <w:lvlText w:val=""/>
+      <w:lvlJc w:val="left"/>
+      <w:pPr>
+        <w:tabs>
+          <w:tab w:val="num" w:pos="4320"/>
+        </w:tabs>
+        <w:ind w:left="4320" w:hanging="360"/>
+      </w:pPr>
+      <w:rPr>
+        <w:rFonts w:ascii="Wingdings" w:hAnsi="Wingdings" w:hint="default"/>
+        <w:sz w:val="20"/>
+      </w:rPr>
+    </w:lvl>
+    <w:lvl w:ilvl="6" w:tentative="1">
+      <w:start w:val="1"/>
+      <w:numFmt w:val="bullet"/>
+      <w:lvlText w:val=""/>
+      <w:lvlJc w:val="left"/>
+      <w:pPr>
+        <w:tabs>
+          <w:tab w:val="num" w:pos="5040"/>
+        </w:tabs>
+        <w:ind w:left="5040" w:hanging="360"/>
+      </w:pPr>
+      <w:rPr>
+        <w:rFonts w:ascii="Wingdings" w:hAnsi="Wingdings" w:hint="default"/>
+        <w:sz w:val="20"/>
+      </w:rPr>
+    </w:lvl>
+    <w:lvl w:ilvl="7" w:tentative="1">
+      <w:start w:val="1"/>
+      <w:numFmt w:val="bullet"/>
+      <w:lvlText w:val=""/>
+      <w:lvlJc w:val="left"/>
+      <w:pPr>
+        <w:tabs>
+          <w:tab w:val="num" w:pos="5760"/>
+        </w:tabs>
+        <w:ind w:left="5760" w:hanging="360"/>
+      </w:pPr>
+      <w:rPr>
+        <w:rFonts w:ascii="Wingdings" w:hAnsi="Wingdings" w:hint="default"/>
+        <w:sz w:val="20"/>
+      </w:rPr>
+    </w:lvl>
+    <w:lvl w:ilvl="8" w:tentative="1">
+      <w:start w:val="1"/>
+      <w:numFmt w:val="bullet"/>
+      <w:lvlText w:val=""/>
+      <w:lvlJc w:val="left"/>
+      <w:pPr>
+        <w:tabs>
+          <w:tab w:val="num" w:pos="6480"/>
+        </w:tabs>
+        <w:ind w:left="6480" w:hanging="360"/>
+      </w:pPr>
+      <w:rPr>
+        <w:rFonts w:ascii="Wingdings" w:hAnsi="Wingdings" w:hint="default"/>
+        <w:sz w:val="20"/>
+      </w:rPr>
+    </w:lvl>
+  </w:abstractNum>
+  <w:abstractNum w:abstractNumId="2">
+    <w:nsid w:val="7E1D6351"/>
+    <w:multiLevelType w:val="multilevel"/>
+    <w:tmpl w:val="E9C84CC4"/>
+    <w:lvl w:ilvl="0">
+      <w:start w:val="1"/>
+      <w:numFmt w:val="decimal"/>
+      <w:lvlText w:val="%1."/>
+      <w:lvlJc w:val="left"/>
+      <w:pPr>
+        <w:tabs>
+          <w:tab w:val="num" w:pos="720"/>
+        </w:tabs>
+        <w:ind w:left="720" w:hanging="360"/>
+      </w:pPr>
+    </w:lvl>
+    <w:lvl w:ilvl="1" w:tentative="1">
+      <w:start w:val="1"/>
+      <w:numFmt w:val="decimal"/>
+      <w:lvlText w:val="%2."/>
+      <w:lvlJc w:val="left"/>
+      <w:pPr>
+        <w:tabs>
+          <w:tab w:val="num" w:pos="1440"/>
+        </w:tabs>
+        <w:ind w:left="1440" w:hanging="360"/>
+      </w:pPr>
+    </w:lvl>
+    <w:lvl w:ilvl="2" w:tentative="1">
+      <w:start w:val="1"/>
+      <w:numFmt w:val="decimal"/>
+      <w:lvlText w:val="%3."/>
+      <w:lvlJc w:val="left"/>
+      <w:pPr>
+        <w:tabs>
+          <w:tab w:val="num" w:pos="2160"/>
+        </w:tabs>
+        <w:ind w:left="2160" w:hanging="360"/>
+      </w:pPr>
+    </w:lvl>
+    <w:lvl w:ilvl="3" w:tentative="1">
+      <w:start w:val="1"/>
+      <w:numFmt w:val="decimal"/>
+      <w:lvlText w:val="%4."/>
+      <w:lvlJc w:val="left"/>
+      <w:pPr>
+        <w:tabs>
+          <w:tab w:val="num" w:pos="2880"/>
+        </w:tabs>
+        <w:ind w:left="2880" w:hanging="360"/>
+      </w:pPr>
+    </w:lvl>
+    <w:lvl w:ilvl="4" w:tentative="1">
+      <w:start w:val="1"/>
+      <w:numFmt w:val="decimal"/>
+      <w:lvlText w:val="%5."/>
+      <w:lvlJc w:val="left"/>
+      <w:pPr>
+        <w:tabs>
+          <w:tab w:val="num" w:pos="3600"/>
+        </w:tabs>
+        <w:ind w:left="3600" w:hanging="360"/>
+      </w:pPr>
+    </w:lvl>
+    <w:lvl w:ilvl="5" w:tentative="1">
+      <w:start w:val="1"/>
+      <w:numFmt w:val="decimal"/>
+      <w:lvlText w:val="%6."/>
+      <w:lvlJc w:val="left"/>
+      <w:pPr>
+        <w:tabs>
+          <w:tab w:val="num" w:pos="4320"/>
+        </w:tabs>
+        <w:ind w:left="4320" w:hanging="360"/>
+      </w:pPr>
+    </w:lvl>
+    <w:lvl w:ilvl="6" w:tentative="1">
+      <w:start w:val="1"/>
+      <w:numFmt w:val="decimal"/>
+      <w:lvlText w:val="%7."/>
+      <w:lvlJc w:val="left"/>
+      <w:pPr>
+        <w:tabs>
+          <w:tab w:val="num" w:pos="5040"/>
+        </w:tabs>
+        <w:ind w:left="5040" w:hanging="360"/>
+      </w:pPr>
+    </w:lvl>
+    <w:lvl w:ilvl="7" w:tentative="1">
+      <w:start w:val="1"/>
+      <w:numFmt w:val="decimal"/>
+      <w:lvlText w:val="%8."/>
+      <w:lvlJc w:val="left"/>
+      <w:pPr>
+        <w:tabs>
+          <w:tab w:val="num" w:pos="5760"/>
+        </w:tabs>
+        <w:ind w:left="5760" w:hanging="360"/>
+      </w:pPr>
+    </w:lvl>
+    <w:lvl w:ilvl="8" w:tentative="1">
+      <w:start w:val="1"/>
+      <w:numFmt w:val="decimal"/>
+      <w:lvlText w:val="%9."/>
+      <w:lvlJc w:val="left"/>
+      <w:pPr>
+        <w:tabs>
+          <w:tab w:val="num" w:pos="6480"/>
+        </w:tabs>
+        <w:ind w:left="6480" w:hanging="360"/>
+      </w:pPr>
+    </w:lvl>
+  </w:abstractNum>
+  <w:abstractNum w:abstractNumId="3">
+    <w:nsid w:val="7F1A6B01"/>
+    <w:multiLevelType w:val="multilevel"/>
+    <w:tmpl w:val="CA280FC2"/>
+    <w:lvl w:ilvl="0">
+      <w:start w:val="1"/>
+      <w:numFmt w:val="bullet"/>
+      <w:lvlText w:val=""/>
+      <w:lvlJc w:val="left"/>
+      <w:pPr>
+        <w:tabs>
+          <w:tab w:val="num" w:pos="720"/>
+        </w:tabs>
+        <w:ind w:left="720" w:hanging="360"/>
+      </w:pPr>
+      <w:rPr>
+        <w:rFonts w:ascii="Symbol" w:hAnsi="Symbol" w:hint="default"/>
+        <w:sz w:val="20"/>
+      </w:rPr>
+    </w:lvl>
+    <w:lvl w:ilvl="1" w:tentative="1">
+      <w:start w:val="1"/>
+      <w:numFmt w:val="bullet"/>
+      <w:lvlText w:val="o"/>
+      <w:lvlJc w:val="left"/>
+      <w:pPr>
+        <w:tabs>
+          <w:tab w:val="num" w:pos="1440"/>
+        </w:tabs>
+        <w:ind w:left="1440" w:hanging="360"/>
+      </w:pPr>
+      <w:rPr>
+        <w:rFonts w:ascii="Courier New" w:hAnsi="Courier New" w:hint="default"/>
+        <w:sz w:val="20"/>
+      </w:rPr>
+    </w:lvl>
+    <w:lvl w:ilvl="2" w:tentative="1">
+      <w:start w:val="1"/>
+      <w:numFmt w:val="bullet"/>
+      <w:lvlText w:val=""/>
+      <w:lvlJc w:val="left"/>
+      <w:pPr>
+        <w:tabs>
+          <w:tab w:val="num" w:pos="2160"/>
+        </w:tabs>
+        <w:ind w:left="2160" w:hanging="360"/>
+      </w:pPr>
+      <w:rPr>
+        <w:rFonts w:ascii="Wingdings" w:hAnsi="Wingdings" w:hint="default"/>
+        <w:sz w:val="20"/>
+      </w:rPr>
+    </w:lvl>
+    <w:lvl w:ilvl="3" w:tentative="1">
+      <w:start w:val="1"/>
+      <w:numFmt w:val="bullet"/>
+      <w:lvlText w:val=""/>
+      <w:lvlJc w:val="left"/>
+      <w:pPr>
+        <w:tabs>
+          <w:tab w:val="num" w:pos="2880"/>
+        </w:tabs>
+        <w:ind w:left="2880" w:hanging="360"/>
+      </w:pPr>
+      <w:rPr>
+        <w:rFonts w:ascii="Wingdings" w:hAnsi="Wingdings" w:hint="default"/>
+        <w:sz w:val="20"/>
+      </w:rPr>
+    </w:lvl>
+    <w:lvl w:ilvl="4" w:tentative="1">
+      <w:start w:val="1"/>
+      <w:numFmt w:val="bullet"/>
+      <w:lvlText w:val=""/>
+      <w:lvlJc w:val="left"/>
+      <w:pPr>
+        <w:tabs>
+          <w:tab w:val="num" w:pos="3600"/>
+        </w:tabs>
+        <w:ind w:left="3600" w:hanging="360"/>
+      </w:pPr>
+      <w:rPr>
+        <w:rFonts w:ascii="Wingdings" w:hAnsi="Wingdings" w:hint="default"/>
+        <w:sz w:val="20"/>
+      </w:rPr>
+    </w:lvl>
+    <w:lvl w:ilvl="5" w:tentative="1">
+      <w:start w:val="1"/>
+      <w:numFmt w:val="bullet"/>
+      <w:lvlText w:val=""/>
+      <w:lvlJc w:val="left"/>
+      <w:pPr>
+        <w:tabs>
+          <w:tab w:val="num" w:pos="4320"/>
+        </w:tabs>
+        <w:ind w:left="4320" w:hanging="360"/>
+      </w:pPr>
+      <w:rPr>
+        <w:rFonts w:ascii="Wingdings" w:hAnsi="Wingdings" w:hint="default"/>
+        <w:sz w:val="20"/>
+      </w:rPr>
+    </w:lvl>
+    <w:lvl w:ilvl="6" w:tentative="1">
+      <w:start w:val="1"/>
+      <w:numFmt w:val="bullet"/>
+      <w:lvlText w:val=""/>
+      <w:lvlJc w:val="left"/>
+      <w:pPr>
+        <w:tabs>
+          <w:tab w:val="num" w:pos="5040"/>
+        </w:tabs>
+        <w:ind w:left="5040" w:hanging="360"/>
+      </w:pPr>
+      <w:rPr>
+        <w:rFonts w:ascii="Wingdings" w:hAnsi="Wingdings" w:hint="default"/>
+        <w:sz w:val="20"/>
+      </w:rPr>
+    </w:lvl>
+    <w:lvl w:ilvl="7" w:tentative="1">
+      <w:start w:val="1"/>
+      <w:numFmt w:val="bullet"/>
+      <w:lvlText w:val=""/>
+      <w:lvlJc w:val="left"/>
+      <w:pPr>
+        <w:tabs>
+          <w:tab w:val="num" w:pos="5760"/>
+        </w:tabs>
+        <w:ind w:left="5760" w:hanging="360"/>
+      </w:pPr>
+      <w:rPr>
+        <w:rFonts w:ascii="Wingdings" w:hAnsi="Wingdings" w:hint="default"/>
+        <w:sz w:val="20"/>
+      </w:rPr>
+    </w:lvl>
+    <w:lvl w:ilvl="8" w:tentative="1">
+      <w:start w:val="1"/>
+      <w:numFmt w:val="bullet"/>
+      <w:lvlText w:val=""/>
+      <w:lvlJc w:val="left"/>
+      <w:pPr>
+        <w:tabs>
+          <w:tab w:val="num" w:pos="6480"/>
+        </w:tabs>
+        <w:ind w:left="6480" w:hanging="360"/>
+      </w:pPr>
+      <w:rPr>
+        <w:rFonts w:ascii="Wingdings" w:hAnsi="Wingdings" w:hint="default"/>
+        <w:sz w:val="20"/>
+      </w:rPr>
+    </w:lvl>
+  </w:abstractNum>
+  <w:num w:numId="1">
+    <w:abstractNumId w:val="0"/>
+  </w:num>
+  <w:num w:numId="2">
+    <w:abstractNumId w:val="2"/>
+  </w:num>
+  <w:num w:numId="3">
+    <w:abstractNumId w:val="1"/>
+  </w:num>
+  <w:num w:numId="4">
+    <w:abstractNumId w:val="3"/>
+  </w:num>
+</w:numbering>
 </file>
 
 <file path=word/styles.xml><?xml version="1.0" encoding="utf-8"?>
@@ -267,6 +1063,58 @@
     <w:rPr>
       <w:color w:val="0563C1" w:themeColor="hyperlink"/>
       <w:u w:val="single"/>
+    </w:rPr>
+  </w:style>
+  <w:style w:type="character" w:styleId="Kiemels2">
+    <w:name w:val="Strong"/>
+    <w:basedOn w:val="Bekezdsalapbettpusa"/>
+    <w:uiPriority w:val="22"/>
+    <w:qFormat/>
+    <w:rsid w:val="005E490D"/>
+    <w:rPr>
+      <w:b/>
+      <w:bCs/>
+    </w:rPr>
+  </w:style>
+  <w:style w:type="character" w:styleId="HTML-kd">
+    <w:name w:val="HTML Code"/>
+    <w:basedOn w:val="Bekezdsalapbettpusa"/>
+    <w:uiPriority w:val="99"/>
+    <w:semiHidden/>
+    <w:unhideWhenUsed/>
+    <w:rsid w:val="005E490D"/>
+    <w:rPr>
+      <w:rFonts w:ascii="Courier New" w:eastAsia="Times New Roman" w:hAnsi="Courier New" w:cs="Courier New"/>
+      <w:sz w:val="20"/>
+      <w:szCs w:val="20"/>
+    </w:rPr>
+  </w:style>
+  <w:style w:type="character" w:styleId="Kiemels">
+    <w:name w:val="Emphasis"/>
+    <w:basedOn w:val="Bekezdsalapbettpusa"/>
+    <w:uiPriority w:val="20"/>
+    <w:qFormat/>
+    <w:rsid w:val="005E490D"/>
+    <w:rPr>
+      <w:i/>
+      <w:iCs/>
+    </w:rPr>
+  </w:style>
+  <w:style w:type="paragraph" w:styleId="NormlWeb">
+    <w:name w:val="Normal (Web)"/>
+    <w:basedOn w:val="Norml"/>
+    <w:uiPriority w:val="99"/>
+    <w:semiHidden/>
+    <w:unhideWhenUsed/>
+    <w:rsid w:val="00DB69B4"/>
+    <w:pPr>
+      <w:spacing w:before="100" w:beforeAutospacing="1" w:after="100" w:afterAutospacing="1" w:line="240" w:lineRule="auto"/>
+    </w:pPr>
+    <w:rPr>
+      <w:rFonts w:ascii="Times New Roman" w:eastAsia="Times New Roman" w:hAnsi="Times New Roman" w:cs="Times New Roman"/>
+      <w:sz w:val="24"/>
+      <w:szCs w:val="24"/>
+      <w:lang w:eastAsia="hu-HU"/>
     </w:rPr>
   </w:style>
 </w:styles>
@@ -561,7 +1409,7 @@
   <a:extraClrSchemeLst/>
   <a:extLst>
     <a:ext uri="{05A4C25C-085E-4340-85A3-A5531E510DB2}">
-      <thm15:themeFamily xmlns:thm15="http://schemas.microsoft.com/office/thememl/2012/main" xmlns="" name="Office Theme" id="{62F939B6-93AF-4DB8-9C6B-D6C7DFDC589F}" vid="{4A3C46E8-61CC-4603-A589-7422A47A8E4A}"/>
+      <thm15:themeFamily xmlns="" xmlns:thm15="http://schemas.microsoft.com/office/thememl/2012/main" name="Office Theme" id="{62F939B6-93AF-4DB8-9C6B-D6C7DFDC589F}" vid="{4A3C46E8-61CC-4603-A589-7422A47A8E4A}"/>
     </a:ext>
   </a:extLst>
 </a:theme>

</xml_diff>